<commit_message>
Tenho acesso a Matlab
</commit_message>
<xml_diff>
--- a/docs/docs/Propostas_de_projeto_MCA.docx
+++ b/docs/docs/Propostas_de_projeto_MCA.docx
@@ -904,15 +904,7 @@
         <w:t xml:space="preserve"> </w:t>
       </w:r>
       <w:r>
-        <w:t xml:space="preserve">de </w:t>
-      </w:r>
-      <w:proofErr w:type="spellStart"/>
-      <w:r>
-        <w:t>Schrondinger</w:t>
-      </w:r>
-      <w:proofErr w:type="spellEnd"/>
-      <w:r>
-        <w:t xml:space="preserve"> aplicada ao átomo de hidrogénio</w:t>
+        <w:t>de Schrondinger aplicada ao átomo de hidrogénio</w:t>
       </w:r>
     </w:p>
     <w:p>
@@ -1513,14 +1505,7 @@
           <w:b/>
           <w:bCs/>
         </w:rPr>
-        <w:t xml:space="preserve">Condição </w:t>
-      </w:r>
-      <w:r>
-        <w:rPr>
-          <w:b/>
-          <w:bCs/>
-        </w:rPr>
-        <w:t>inicial:</w:t>
+        <w:t>Condição inicial:</w:t>
       </w:r>
       <w:r>
         <w:rPr>
@@ -1549,14 +1534,7 @@
           <w:b/>
           <w:bCs/>
         </w:rPr>
-        <w:t>Fronteira(s</w:t>
-      </w:r>
-      <w:r>
-        <w:rPr>
-          <w:b/>
-          <w:bCs/>
-        </w:rPr>
-        <w:t>):</w:t>
+        <w:t>Fronteira(s):</w:t>
       </w:r>
       <w:r>
         <w:rPr>
@@ -2128,24 +2106,35 @@
       </w:r>
     </w:p>
     <w:p>
+      <w:r>
+        <w:rPr>
+          <w:b/>
+          <w:bCs/>
+        </w:rPr>
+        <w:t>Significado físico das CF</w:t>
+      </w:r>
+      <w:r>
+        <w:t>:</w:t>
+      </w:r>
+      <w:r>
+        <w:t xml:space="preserve"> ???</w:t>
+      </w:r>
+    </w:p>
+    <w:p/>
+    <w:p/>
+    <w:p>
       <w:pPr>
         <w:rPr>
           <w:b/>
           <w:bCs/>
+          <w:u w:val="single"/>
         </w:rPr>
       </w:pPr>
       <w:r>
         <w:rPr>
-          <w:b/>
-          <w:bCs/>
-        </w:rPr>
-        <w:t>Significado físico das CF</w:t>
-      </w:r>
-      <w:r>
-        <w:t>:</w:t>
-      </w:r>
-      <w:r>
-        <w:t xml:space="preserve"> ???</w:t>
+          <w:u w:val="single"/>
+        </w:rPr>
+        <w:t>Teste</w:t>
       </w:r>
     </w:p>
     <w:sectPr>

</xml_diff>